<commit_message>
Fix final report consistency after DQN-scope enforcement
Two textual fixes:

1. Section 7 / Table 10 timing note: update stale Sprintlink/Tiscali timings
   (597ms/673ms/1366ms/2265ms) to current values from Table 10
   (1055.7ms/1831.6ms/1594.0ms/2730.6ms).

2. Final Safe Claims: remove false claim "PR >= 95% on all non-disconnecting
   scenarios (Abilene + GEANT, 9 scenarios)" — this was invalidated by the
   corrected failure-validation rerun with DQN-scope enforced. Replace with
   honest limitation statement: link-failure cases become BudgetInfeasible
   and fall back to ECMP (near-zero PR); failure validation is a limitation,
   not a robustness win.

Verification: grep confirms all three stale patterns are absent.
Smoke test PASS; audit 13/13 PASS.
</commit_message>
<xml_diff>
--- a/results/gnn_lpd_dqn_selective_db_lp/STUDENT_PROFESSOR_FINAL_REPORT.docx
+++ b/results/gnn_lpd_dqn_selective_db_lp/STUDENT_PROFESSOR_FINAL_REPORT.docx
@@ -19348,9 +19348,9 @@
         <w:br/>
         <w:t>Full-OD fallback was never triggered (FO=0.0% on all topologies). All cycles used selected-K</w:t>
         <w:br/>
-        <w:t>LP only. Mean decision time is below 500 ms on six of eight topologies. Sprintlink (mean 597 ms,</w:t>
+        <w:t>LP only. Mean decision time is below 500 ms on six of eight topologies. Sprintlink (mean 1,055.7 ms,</w:t>
         <w:br/>
-        <w:t>P95 673 ms) and Tiscali (mean 1366 ms, P95 2265 ms) are elevated because K1600 and K1000 LPs</w:t>
+        <w:t>P95 1,831.6 ms) and Tiscali (mean 1,594.0 ms, P95 2,730.6 ms) are elevated because K1600 and K1000 LPs</w:t>
         <w:br/>
         <w:t>are required for every cycle on these dense topologies. All LP solves complete well within the</w:t>
         <w:br/>
@@ -36285,11 +36285,15 @@
         <w:br/>
         <w:t>Full-OD fallback rate is 0.0% — the DQN never selected full-OD actions in this evaluation.</w:t>
         <w:br/>
-        <w:t>All LP solves completed within the 60-second per-LP time limit. Under failure scenarios</w:t>
+        <w:t>All LP solves completed within the 60-second per-LP time limit. Under failure scenarios,</w:t>
         <w:br/>
-        <w:t>(Section 9), the method maintains PR ≥ 95% on all non-disconnecting scenarios (Abilene + GEANT,</w:t>
+        <w:t>the clean method exposes a limitation: with strict DQN-scope enforcement and no hidden</w:t>
         <w:br/>
-        <w:t>9 scenarios, clean audit PASS).</w:t>
+        <w:t>full-OD fallback, link-failure cases can become BudgetInfeasible and fall back to ECMP,</w:t>
+        <w:br/>
+        <w:t>producing near-zero PR in several failure scenarios. Therefore, failure validation is</w:t>
+        <w:br/>
+        <w:t>reported as a limitation rather than as a robustness win.</w:t>
         <w:br/>
         <w:t>SDN / Mininet operational validation (Section 10, Table 13) preserves the original live Mininet</w:t>
         <w:br/>

</xml_diff>